<commit_message>
Votre message de mise à jour
</commit_message>
<xml_diff>
--- a/Code.docx
+++ b/Code.docx
@@ -45,6 +45,24 @@
       <w:r>
         <w:t xml:space="preserve"> master</w:t>
       </w:r>
+    </w:p>
+    <w:p/>
+    <w:p>
+      <w:proofErr w:type="spellStart"/>
+      <w:proofErr w:type="gramStart"/>
+      <w:r>
+        <w:t>heroku</w:t>
+      </w:r>
+      <w:proofErr w:type="spellEnd"/>
+      <w:proofErr w:type="gramEnd"/>
+      <w:r>
+        <w:t xml:space="preserve"> logs --</w:t>
+      </w:r>
+      <w:proofErr w:type="spellStart"/>
+      <w:r>
+        <w:t>tail</w:t>
+      </w:r>
+      <w:proofErr w:type="spellEnd"/>
     </w:p>
     <w:sectPr>
       <w:pgSz w:w="11906" w:h="16838"/>
@@ -458,7 +476,6 @@
   <w:style w:type="character" w:default="1" w:styleId="Policepardfaut">
     <w:name w:val="Default Paragraph Font"/>
     <w:uiPriority w:val="1"/>
-    <w:semiHidden/>
     <w:unhideWhenUsed/>
   </w:style>
   <w:style w:type="table" w:default="1" w:styleId="TableauNormal">

</xml_diff>